<commit_message>
Add AHT21 to indoor display cycle
</commit_message>
<xml_diff>
--- a/documents/DeskSideClock_ソフトウェア仕様書_v2.3.10.docx
+++ b/documents/DeskSideClock_ソフトウェア仕様書_v2.3.10.docx
@@ -1909,11 +1909,7 @@
           </w:tcPr>
           <w:p>
             <w:r>
-              <w:rPr>
-                <w:rFonts w:ascii="Arial" w:hAnsi="Arial"/>
-                <w:sz w:val="17"/>
-              </w:rPr>
-              <w:t>SHT20→SwitchBot→BME280をタップで巡回する。無効・未取得・期限切れの候補は飛ばす。</w:t>
+              <w:t>SHT20→AHT21→SwitchBot→BME280をタップで巡回する。無効・未取得・期限切れの候補は飛ばす。</w:t>
             </w:r>
           </w:p>
         </w:tc>
@@ -8073,11 +8069,7 @@
           </w:tcPr>
           <w:p>
             <w:r>
-              <w:rPr>
-                <w:rFonts w:ascii="Arial" w:hAnsi="Arial"/>
-                <w:sz w:val="17"/>
-              </w:rPr>
-              <w:t>SHT20→SwitchBot→BME280→SHT20。無効候補は飛ばす</w:t>
+              <w:t>SHT20→AHT21→SwitchBot→BME280→SHT20。無効候補は飛ばす</w:t>
             </w:r>
           </w:p>
         </w:tc>

</xml_diff>

<commit_message>
Apply requested sensor measurement offsets
</commit_message>
<xml_diff>
--- a/documents/DeskSideClock_ソフトウェア仕様書_v2.3.10.docx
+++ b/documents/DeskSideClock_ソフトウェア仕様書_v2.3.10.docx
@@ -3668,6 +3668,26 @@
             <w:vAlign w:val="center"/>
           </w:tcPr>
           <w:p>
+            <w:r>
+              <w:t>温度-9.0℃、湿度+14%RH</w:t>
+            </w:r>
+          </w:p>
+        </w:tc>
+      </w:tr>
+      <w:tr>
+        <w:tc>
+          <w:tcPr>
+            <w:tcW w:type="dxa" w:w="1250"/>
+            <w:tcMar>
+              <w:top w:w="90" w:type="dxa"/>
+              <w:start w:w="120" w:type="dxa"/>
+              <w:bottom w:w="90" w:type="dxa"/>
+              <w:end w:w="120" w:type="dxa"/>
+            </w:tcMar>
+            <w:vAlign w:val="center"/>
+            <w:shd w:fill="F8FAFC"/>
+          </w:tcPr>
+          <w:p>
             <w:pPr>
               <w:spacing w:after="0" w:line="259" w:lineRule="auto"/>
             </w:pPr>
@@ -3676,12 +3696,10 @@
                 <w:rFonts w:ascii="Arial" w:hAnsi="Arial" w:eastAsia="Noto Sans JP"/>
                 <w:sz w:val="17"/>
               </w:rPr>
-              <w:t>温度-4.2℃、湿度0%</w:t>
-            </w:r>
-          </w:p>
-        </w:tc>
-      </w:tr>
-      <w:tr>
+              <w:t>AHT21</w:t>
+            </w:r>
+          </w:p>
+        </w:tc>
         <w:tc>
           <w:tcPr>
             <w:tcW w:type="dxa" w:w="1250"/>
@@ -3703,13 +3721,31 @@
                 <w:rFonts w:ascii="Arial" w:hAnsi="Arial" w:eastAsia="Noto Sans JP"/>
                 <w:sz w:val="17"/>
               </w:rPr>
-              <w:t>AHT21</w:t>
-            </w:r>
-          </w:p>
-        </w:tc>
-        <w:tc>
-          <w:tcPr>
-            <w:tcW w:type="dxa" w:w="1250"/>
+              <w:t>I²C 0x38</w:t>
+            </w:r>
+          </w:p>
+        </w:tc>
+        <w:tc>
+          <w:tcPr>
+            <w:tcW w:type="dxa" w:w="2250"/>
+            <w:tcMar>
+              <w:top w:w="90" w:type="dxa"/>
+              <w:start w:w="120" w:type="dxa"/>
+              <w:bottom w:w="90" w:type="dxa"/>
+              <w:end w:w="120" w:type="dxa"/>
+            </w:tcMar>
+            <w:vAlign w:val="center"/>
+            <w:shd w:fill="F8FAFC"/>
+          </w:tcPr>
+          <w:p>
+            <w:r>
+              <w:t>温度・湿度（室温巡回対象）</w:t>
+            </w:r>
+          </w:p>
+        </w:tc>
+        <w:tc>
+          <w:tcPr>
+            <w:tcW w:type="dxa" w:w="1750"/>
             <w:tcMar>
               <w:top w:w="90" w:type="dxa"/>
               <w:start w:w="120" w:type="dxa"/>
@@ -3728,13 +3764,13 @@
                 <w:rFonts w:ascii="Arial" w:hAnsi="Arial" w:eastAsia="Noto Sans JP"/>
                 <w:sz w:val="17"/>
               </w:rPr>
-              <w:t>I²C 0x38</w:t>
-            </w:r>
-          </w:p>
-        </w:tc>
-        <w:tc>
-          <w:tcPr>
-            <w:tcW w:type="dxa" w:w="2250"/>
+              <w:t>5秒</w:t>
+            </w:r>
+          </w:p>
+        </w:tc>
+        <w:tc>
+          <w:tcPr>
+            <w:tcW w:type="dxa" w:w="2860"/>
             <w:tcMar>
               <w:top w:w="90" w:type="dxa"/>
               <w:start w:w="120" w:type="dxa"/>
@@ -3743,6 +3779,25 @@
             </w:tcMar>
             <w:vAlign w:val="center"/>
             <w:shd w:fill="F8FAFC"/>
+          </w:tcPr>
+          <w:p>
+            <w:r>
+              <w:t>温度-7.1℃、湿度+11%RH</w:t>
+            </w:r>
+          </w:p>
+        </w:tc>
+      </w:tr>
+      <w:tr>
+        <w:tc>
+          <w:tcPr>
+            <w:tcW w:type="dxa" w:w="1250"/>
+            <w:tcMar>
+              <w:top w:w="90" w:type="dxa"/>
+              <w:start w:w="120" w:type="dxa"/>
+              <w:bottom w:w="90" w:type="dxa"/>
+              <w:end w:w="120" w:type="dxa"/>
+            </w:tcMar>
+            <w:vAlign w:val="center"/>
           </w:tcPr>
           <w:p>
             <w:pPr>
@@ -3753,21 +3808,20 @@
                 <w:rFonts w:ascii="Arial" w:hAnsi="Arial" w:eastAsia="Noto Sans JP"/>
                 <w:sz w:val="17"/>
               </w:rPr>
-              <w:t>温度・湿度（取得済みだが通常巡回外）</w:t>
-            </w:r>
-          </w:p>
-        </w:tc>
-        <w:tc>
-          <w:tcPr>
-            <w:tcW w:type="dxa" w:w="1750"/>
-            <w:tcMar>
-              <w:top w:w="90" w:type="dxa"/>
-              <w:start w:w="120" w:type="dxa"/>
-              <w:bottom w:w="90" w:type="dxa"/>
-              <w:end w:w="120" w:type="dxa"/>
-            </w:tcMar>
-            <w:vAlign w:val="center"/>
-            <w:shd w:fill="F8FAFC"/>
+              <w:t>BME280</w:t>
+            </w:r>
+          </w:p>
+        </w:tc>
+        <w:tc>
+          <w:tcPr>
+            <w:tcW w:type="dxa" w:w="1250"/>
+            <w:tcMar>
+              <w:top w:w="90" w:type="dxa"/>
+              <w:start w:w="120" w:type="dxa"/>
+              <w:bottom w:w="90" w:type="dxa"/>
+              <w:end w:w="120" w:type="dxa"/>
+            </w:tcMar>
+            <w:vAlign w:val="center"/>
           </w:tcPr>
           <w:p>
             <w:pPr>
@@ -3778,21 +3832,20 @@
                 <w:rFonts w:ascii="Arial" w:hAnsi="Arial" w:eastAsia="Noto Sans JP"/>
                 <w:sz w:val="17"/>
               </w:rPr>
-              <w:t>5秒</w:t>
-            </w:r>
-          </w:p>
-        </w:tc>
-        <w:tc>
-          <w:tcPr>
-            <w:tcW w:type="dxa" w:w="2860"/>
-            <w:tcMar>
-              <w:top w:w="90" w:type="dxa"/>
-              <w:start w:w="120" w:type="dxa"/>
-              <w:bottom w:w="90" w:type="dxa"/>
-              <w:end w:w="120" w:type="dxa"/>
-            </w:tcMar>
-            <w:vAlign w:val="center"/>
-            <w:shd w:fill="F8FAFC"/>
+              <w:t>I²C 0x76</w:t>
+            </w:r>
+          </w:p>
+        </w:tc>
+        <w:tc>
+          <w:tcPr>
+            <w:tcW w:type="dxa" w:w="2250"/>
+            <w:tcMar>
+              <w:top w:w="90" w:type="dxa"/>
+              <w:start w:w="120" w:type="dxa"/>
+              <w:bottom w:w="90" w:type="dxa"/>
+              <w:end w:w="120" w:type="dxa"/>
+            </w:tcMar>
+            <w:vAlign w:val="center"/>
           </w:tcPr>
           <w:p>
             <w:pPr>
@@ -3803,15 +3856,13 @@
                 <w:rFonts w:ascii="Arial" w:hAnsi="Arial" w:eastAsia="Noto Sans JP"/>
                 <w:sz w:val="17"/>
               </w:rPr>
-              <w:t>なし</w:t>
-            </w:r>
-          </w:p>
-        </w:tc>
-      </w:tr>
-      <w:tr>
-        <w:tc>
-          <w:tcPr>
-            <w:tcW w:type="dxa" w:w="1250"/>
+              <w:t>温度・湿度・気圧</w:t>
+            </w:r>
+          </w:p>
+        </w:tc>
+        <w:tc>
+          <w:tcPr>
+            <w:tcW w:type="dxa" w:w="1750"/>
             <w:tcMar>
               <w:top w:w="90" w:type="dxa"/>
               <w:start w:w="120" w:type="dxa"/>
@@ -3829,78 +3880,6 @@
                 <w:rFonts w:ascii="Arial" w:hAnsi="Arial" w:eastAsia="Noto Sans JP"/>
                 <w:sz w:val="17"/>
               </w:rPr>
-              <w:t>BME280</w:t>
-            </w:r>
-          </w:p>
-        </w:tc>
-        <w:tc>
-          <w:tcPr>
-            <w:tcW w:type="dxa" w:w="1250"/>
-            <w:tcMar>
-              <w:top w:w="90" w:type="dxa"/>
-              <w:start w:w="120" w:type="dxa"/>
-              <w:bottom w:w="90" w:type="dxa"/>
-              <w:end w:w="120" w:type="dxa"/>
-            </w:tcMar>
-            <w:vAlign w:val="center"/>
-          </w:tcPr>
-          <w:p>
-            <w:pPr>
-              <w:spacing w:after="0" w:line="259" w:lineRule="auto"/>
-            </w:pPr>
-            <w:r>
-              <w:rPr>
-                <w:rFonts w:ascii="Arial" w:hAnsi="Arial" w:eastAsia="Noto Sans JP"/>
-                <w:sz w:val="17"/>
-              </w:rPr>
-              <w:t>I²C 0x76</w:t>
-            </w:r>
-          </w:p>
-        </w:tc>
-        <w:tc>
-          <w:tcPr>
-            <w:tcW w:type="dxa" w:w="2250"/>
-            <w:tcMar>
-              <w:top w:w="90" w:type="dxa"/>
-              <w:start w:w="120" w:type="dxa"/>
-              <w:bottom w:w="90" w:type="dxa"/>
-              <w:end w:w="120" w:type="dxa"/>
-            </w:tcMar>
-            <w:vAlign w:val="center"/>
-          </w:tcPr>
-          <w:p>
-            <w:pPr>
-              <w:spacing w:after="0" w:line="259" w:lineRule="auto"/>
-            </w:pPr>
-            <w:r>
-              <w:rPr>
-                <w:rFonts w:ascii="Arial" w:hAnsi="Arial" w:eastAsia="Noto Sans JP"/>
-                <w:sz w:val="17"/>
-              </w:rPr>
-              <w:t>温度・湿度・気圧</w:t>
-            </w:r>
-          </w:p>
-        </w:tc>
-        <w:tc>
-          <w:tcPr>
-            <w:tcW w:type="dxa" w:w="1750"/>
-            <w:tcMar>
-              <w:top w:w="90" w:type="dxa"/>
-              <w:start w:w="120" w:type="dxa"/>
-              <w:bottom w:w="90" w:type="dxa"/>
-              <w:end w:w="120" w:type="dxa"/>
-            </w:tcMar>
-            <w:vAlign w:val="center"/>
-          </w:tcPr>
-          <w:p>
-            <w:pPr>
-              <w:spacing w:after="0" w:line="259" w:lineRule="auto"/>
-            </w:pPr>
-            <w:r>
-              <w:rPr>
-                <w:rFonts w:ascii="Arial" w:hAnsi="Arial" w:eastAsia="Noto Sans JP"/>
-                <w:sz w:val="17"/>
-              </w:rPr>
               <w:t>5秒／30秒で期限切れ</w:t>
             </w:r>
           </w:p>
@@ -3917,15 +3896,8 @@
             <w:vAlign w:val="center"/>
           </w:tcPr>
           <w:p>
-            <w:pPr>
-              <w:spacing w:after="0" w:line="259" w:lineRule="auto"/>
-            </w:pPr>
-            <w:r>
-              <w:rPr>
-                <w:rFonts w:ascii="Arial" w:hAnsi="Arial" w:eastAsia="Noto Sans JP"/>
-                <w:sz w:val="17"/>
-              </w:rPr>
-              <w:t>公開温度-4.5℃</w:t>
+            <w:r>
+              <w:t>温度-5.2℃、湿度+15%RH</w:t>
             </w:r>
           </w:p>
         </w:tc>
@@ -8133,11 +8105,7 @@
           </w:tcPr>
           <w:p>
             <w:r>
-              <w:rPr>
-                <w:rFonts w:ascii="Arial" w:hAnsi="Arial"/>
-                <w:sz w:val="17"/>
-              </w:rPr>
-              <w:t>SHT20は生値-4.2℃、BME280は生値-4.5℃で表示される</w:t>
+              <w:t>SHT20は生値-9.0℃／+14%RH、AHT21は生値-7.1℃／+11%RH、BME280は生値-5.2℃／+15%RHで表示される</w:t>
             </w:r>
           </w:p>
         </w:tc>

</xml_diff>